<commit_message>
Add trained vault scoring model
</commit_message>
<xml_diff>
--- a/VaultLab_Research_Paper.docx
+++ b/VaultLab_Research_Paper.docx
@@ -105,7 +105,7 @@
           <w:i w:val="0"/>
           <w:sz w:val="24"/>
         </w:rPr>
-        <w:t>The current prototype focuses on three deliverables: a React web app for video upload and attempt logging, a pose-estimation pipeline for extracting joint-based measurements, and a research workflow that exports labeled attempt data for logistic regression.</w:t>
+        <w:t>The final app focuses on three connected deliverables: a React web app for video upload and attempt logging, a pose-estimation pipeline for extracting joint-based measurements, and an in-app logistic regression model trained from labeled vault attempts.</w:t>
       </w:r>
     </w:p>
     <w:p>
@@ -203,7 +203,7 @@
           <w:i w:val="0"/>
           <w:sz w:val="24"/>
         </w:rPr>
-        <w:t>The prototype uses MediaPipe Pose Landmarker in the browser. According to Google's documentation, the task can detect human body landmarks from images or video and returns pose landmarks in image coordinates and world coordinates. VaultLab samples frames across the uploaded video, applies pose estimation, and draws a skeleton overlay so users can visually inspect whether the AI is tracking the athlete.</w:t>
+        <w:t>The app uses MediaPipe Pose Landmarker in the browser. According to Google's documentation, the task can detect human body landmarks from images or video and returns pose landmarks in image coordinates and world coordinates. VaultLab samples frames across the uploaded video, applies pose estimation, and draws a skeleton overlay so users can visually inspect whether the AI is tracking the athlete.</w:t>
       </w:r>
     </w:p>
     <w:p>
@@ -812,7 +812,7 @@
           <w:i w:val="0"/>
           <w:sz w:val="24"/>
         </w:rPr>
-        <w:t>The next research layer is logistic regression. Logistic regression is appropriate for this first model because the target variable is binary: make or miss. The exported dataset can be represented as rows of attempts and columns of features. A future Python notebook will standardize features, train a logistic regression classifier, evaluate accuracy with train/test splits or cross-validation, and inspect feature coefficients to explain which variables have the strongest relationship with success.</w:t>
+        <w:t>The predictive layer is logistic regression. Logistic regression is appropriate because the target variable is binary: make or miss. VaultLab represents saved attempts as rows and vault measurements as feature columns. The app standardizes features, trains a logistic regression classifier from the athlete's saved labeled attempts, and uses model coefficients to explain which variables have the strongest relationship with success.</w:t>
       </w:r>
     </w:p>
     <w:p>
@@ -882,7 +882,7 @@
           <w:i w:val="0"/>
           <w:sz w:val="24"/>
         </w:rPr>
-        <w:t>The current prototype has been implemented and deployed. It can authenticate users, offer a demo mode for judges, upload and preview a full vault video, run browser-based pose estimation, display joint markers on the video, estimate takeoff and inversion measurements, calculate approach speed and flight time when enough data is entered, store attempts in a user-specific log, and export attempt data as CSV.</w:t>
+        <w:t>The final app has been implemented and deployed. It can authenticate users, offer a demo mode for judges, upload and preview a full vault video, run browser-based pose estimation, display joint markers on the video, estimate takeoff and inversion measurements, calculate approach speed and flight time when enough data is entered, store attempts in a user-specific log, train a logistic regression model, and export attempt data as CSV.</w:t>
       </w:r>
     </w:p>
     <w:p>
@@ -896,7 +896,7 @@
           <w:i w:val="0"/>
           <w:sz w:val="24"/>
         </w:rPr>
-        <w:t>The prototype also includes a Competition Research Mode panel. This panel counts total saved attempts, identifies how many rows are model-ready, displays the make rate, and clarifies that the prediction target is make/miss. This directly connects the web app to the planned logistic-regression study.</w:t>
+        <w:t>The app includes a Trained Vault Model panel. This panel counts training rows, displays the make rate, shows the current vault's predicted make probability, and explains that the model inputs are approach speed, grip over bar, flight time, takeoff angle, and inversion angle. The model tech score is the predicted make probability converted to a 0-100 athlete-facing score.</w:t>
       </w:r>
     </w:p>
     <w:p>
@@ -952,7 +952,7 @@
           <w:i w:val="0"/>
           <w:sz w:val="24"/>
         </w:rPr>
-        <w:t>The next stage is to collect 30-50 labeled vault attempts, train the first logistic regression model, and report metrics such as accuracy, precision, recall, and the most influential coefficients. Later versions could add cloud storage, Firestore data sync, a Python backend with YOLO Pose or RTMPose, pole and bar detection, and two-camera calibration for more accurate measurements.</w:t>
+        <w:t>The next validation stage is to collect 30-50 labeled vault attempts and report model metrics such as accuracy, precision, recall, and the most influential coefficients. Later versions could add cloud storage, Firestore data sync, a Python backend with YOLO Pose or RTMPose, pole and bar detection, and two-camera calibration for more accurate measurements.</w:t>
       </w:r>
     </w:p>
     <w:p>
@@ -966,7 +966,7 @@
           <w:i w:val="0"/>
           <w:sz w:val="24"/>
         </w:rPr>
-        <w:t>For the competition, the project demonstrates a full STEM innovation cycle: identify a real athletic problem, build a working AI prototype, connect it to a research question, collect structured data, and design an interpretable model that can guide improvement.</w:t>
+        <w:t>For the competition, the project demonstrates a full STEM innovation cycle: identify a real athletic problem, build a working AI application, connect it to a research question, collect structured data, and train an interpretable model that can guide improvement.</w:t>
       </w:r>
     </w:p>
     <w:p>

</xml_diff>